<commit_message>
feat: auto-fit column widths in all Excel exports
SheetJS defaults every column to ~8 chars, so users had to manually
stretch each column to read grade, dimensions, position, etc. Added a
shared autoFitColumns() helper that sizes each column to its longest
cell (header included), clamped to 8-60 chars. Wired into the KTS/GPAO
zestawienie export, the analytics panel export (both sheets), and the
PGL price-history export. Also logged in the 1.7 version report.

Co-Authored-By: Claude Sonnet 5 <noreply@anthropic.com>
Claude-Session: https://claude.ai/code/session_01BDnD2iGP2DepefWUr6pgt4
</commit_message>
<xml_diff>
--- a/Historia wersji oraz md/Historia wersji/AMSteel_Quote_Raport_Wersji_1.7.docx
+++ b/Historia wersji oraz md/Historia wersji/AMSteel_Quote_Raport_Wersji_1.7.docx
@@ -282,7 +282,7 @@
           </w:tcPr>
           <w:p>
             <w:r>
-              <w:t>Naprawiono błąd zapisu decyzji klienta (wygrana / przegrana) na ofercie wysłanej - konflikt typów parametru w zapytaniu SQL (kod 42P08); wcześniej funkcja nie zapisywała żadnej decyzji. Zablokowano wysyłkę oferty do klienta bez danych firmy klienta (nazwa firmy i NIP) - tworzenie i zapis oferty bez tych danych nadal działają. Senior może zbudować zespół z juniorów (sekcja „Mój zespół” w panelu seniora i administratora), a panel „Analiza” pokazuje mu wtedy dane własne oraz całego zespołu, z możliwością zawężenia do siebie lub wybranego juniora.</w:t>
+              <w:t>Naprawiono błąd zapisu decyzji klienta (wygrana / przegrana) na ofercie wysłanej - konflikt typów parametru w zapytaniu SQL (kod 42P08); wcześniej funkcja nie zapisywała żadnej decyzji. Zablokowano wysyłkę oferty do klienta bez danych firmy klienta (nazwa firmy i NIP) - tworzenie i zapis oferty bez tych danych nadal działają. Senior może zbudować zespół z juniorów (sekcja „Mój zespół” w panelu seniora i administratora), a panel „Analiza” pokazuje mu wtedy dane własne oraz całego zespołu, z możliwością zawężenia do siebie lub wybranego juniora. Eksport ofert, panelu „Analiza” i historii PGL do Excela otwiera się teraz z kolumnami dopasowanymi do zawartości, bez ręcznego rozciągania.</w:t>
             </w:r>
           </w:p>
         </w:tc>
@@ -955,6 +955,28 @@
           </w:p>
         </w:tc>
       </w:tr>
+      <w:tr>
+        <w:tc>
+          <w:tcPr>
+            <w:tcW w:w="1948" w:type="dxa"/>
+          </w:tcPr>
+          <w:p>
+            <w:r>
+              <w:t>Poprawka</w:t>
+            </w:r>
+          </w:p>
+        </w:tc>
+        <w:tc>
+          <w:tcPr>
+            <w:tcW w:w="6908" w:type="dxa"/>
+          </w:tcPr>
+          <w:p>
+            <w:r>
+              <w:t>Eksport do Excela otwiera się z kolumnami dopasowanymi do zawartości. Wcześniej każda kolumna miała domyślną szerokość około ośmiu znaków, więc użytkownik musiał ręcznie rozciągać każdą z nich, żeby odczytać gatunek, wymiary czy pozycję. Szerokość jest teraz liczona z najdłuższej wartości w kolumnie (razem z nagłówkiem) i przycinana do zakresu 8-60 znaków, żeby długi komentarz nie rozjechał arkusza. Dotyczy wszystkich trzech eksportów: zestawienia oferty w formacie KTS/GPAO (Moje oferty, Panel seniora, Panel administratora, kalkulator), panelu „Analiza” oraz historii cen bazowych PGL.</w:t>
+            </w:r>
+          </w:p>
+        </w:tc>
+      </w:tr>
     </w:tbl>
     <w:p>
       <w:pPr>

</xml_diff>

<commit_message>
fix: phantom unsaved-changes prompt after "Nowa oferta"
The unsaved-changes baseline lived in a ref and was captured inside an
effect, so isDirty was read against the stale pre-capture value and the
guard never re-synced (a ref write schedules no follow-up render). Other
call sites dodged this by firing an incidental setState right after;
resetToNewOffer does not, so clicking "Nowa oferta" or the "Kalkulator"
tab while editing a saved offer left a phantom "Niezapisane zmiany"
prompt on an empty, untouched form.

Hold the baseline in state so capturing it triggers a re-render and
isDirty recomputes against the fresh snapshot.

Also logged in the 1.7 version report (Zarzadzanie ofertami + summary).

Co-Authored-By: Claude Sonnet 5 <noreply@anthropic.com>
Claude-Session: https://claude.ai/code/session_012mg9QqZjHGHspYkH9GUqK7
</commit_message>
<xml_diff>
--- a/Historia wersji oraz md/Historia wersji/AMSteel_Quote_Raport_Wersji_1.7.docx
+++ b/Historia wersji oraz md/Historia wersji/AMSteel_Quote_Raport_Wersji_1.7.docx
@@ -293,7 +293,7 @@
               <w:t xml:space="preserve">Naprawiono błąd zapisu decyzji klienta (wygrana / przegrana) na ofercie wysłanej - konflikt typów parametru w zapytaniu SQL (kod 42P08); wcześniej funkcja nie zapisywała żadnej decyzji. Zablokowano wysyłkę oferty do klienta bez danych firmy klienta (nazwa firmy i NIP) - tworzenie i zapis oferty bez tych danych nadal działają. Senior może zbudować zespół z juniorów (sekcja „Mój zespół” w panelu seniora i administratora), a panel „Analiza” pokazuje mu wtedy dane własne oraz całego zespołu, z możliwością zawężenia do siebie lub wybranego juniora. Eksport ofert, panelu „Analiza” i historii PGL do Excela otwiera się teraz z kolumnami dopasowanymi do zawartości, bez ręcznego rozciągania. Dodano automatyczne liczenie transportu z trasy dostawy: rzeczywista odległość drogowa do klienta, cennik przewoźnika w pasmach kilometrowych, przeliczanie na kursy według ładowności 21 t i dopłaty za </w:t>
             </w:r>
             <w:r>
-              <w:t>elementy ponadwymiarowe, wraz z edytowalnym cennikiem w panelu administratora. Wysoki kontrast (jasny i ciemny) przeszedł na nowoczesną paletę kolorów wspólną ze zwykłym motywem – zamiast czerni-na-bieli tryb ten daje teraz większą czcionkę, powiększony widok i grubsze obramowania przy firmowych kolorach.</w:t>
+              <w:t>elementy ponadwymiarowe, wraz z edytowalnym cennikiem w panelu administratora. Wysoki kontrast (jasny i ciemny) przeszedł na nowoczesną paletę kolorów wspólną ze zwykłym motywem – zamiast czerni-na-bieli tryb ten daje teraz większą czcionkę, powiększony widok i grubsze obramowania przy firmowych kolorach. Naprawiono też fałszywe ostrzeżenie o niezapisanych zmianach po rozpoczęciu nowej oferty w trakcie edycji zapisanej – pojawiało się mimo pustego, niezmienionego formularza.</w:t>
             </w:r>
           </w:p>
         </w:tc>
@@ -1067,6 +1067,28 @@
           </w:p>
         </w:tc>
       </w:tr>
+      <w:tr>
+        <w:tc>
+          <w:tcPr>
+            <w:tcW w:w="1948" w:type="dxa"/>
+          </w:tcPr>
+          <w:p>
+            <w:r>
+              <w:t>Poprawka</w:t>
+            </w:r>
+          </w:p>
+        </w:tc>
+        <w:tc>
+          <w:tcPr>
+            <w:tcW w:w="6908" w:type="dxa"/>
+          </w:tcPr>
+          <w:p>
+            <w:r>
+              <w:t>Po kliknięciu „Nowa oferta” lub zakładki „Kalkulator” podczas edycji zapisanej oferty pojawiało się ostrzeżenie o niezapisanych zmianach, mimo że nowa oferta była pusta i nic w niej nie zmieniono. Kalkulator porównywał stan z nieaktualnym punktem odniesienia sprzed wyczyszczenia formularza. Punkt odniesienia jest teraz odświeżany od razu po rozpoczęciu nowej oferty, więc ostrzeżenie pojawia się dopiero, gdy handlowiec faktycznie coś wprowadzi.</w:t>
+            </w:r>
+          </w:p>
+        </w:tc>
+      </w:tr>
     </w:tbl>
     <w:p>
       <w:pPr>

</xml_diff>

<commit_message>
feat: width-based Łezka surcharge + TEARDROP grade table
- Dopłata Łezka now scales with strip width: 30 €/t up to 1.5 m,
  45 €/t above (to 2.05 m per client table) — was a flat 30 €/t
- Populate GRADE_TABLE_TEARDROP from client data (S235/S275/S355 in
  JR/J2 + AR/N variants, plus S355MC/S500MC, each also as -CAT_A);
  default grade S235JR+N when switching to the Łezka tab
- Version report 1.7 updated (Kalkulator wyceny row + history summary)

Co-Authored-By: Claude Sonnet 5 <noreply@anthropic.com>
Claude-Session: https://claude.ai/code/session_01MC9uJgAENixbmvufdJrs3a
</commit_message>
<xml_diff>
--- a/Historia wersji oraz md/Historia wersji/AMSteel_Quote_Raport_Wersji_1.7.docx
+++ b/Historia wersji oraz md/Historia wersji/AMSteel_Quote_Raport_Wersji_1.7.docx
@@ -293,7 +293,7 @@
               <w:t xml:space="preserve">Naprawiono błąd zapisu decyzji klienta (wygrana / przegrana) na ofercie wysłanej - konflikt typów parametru w zapytaniu SQL (kod 42P08); wcześniej funkcja nie zapisywała żadnej decyzji. Zablokowano wysyłkę oferty do klienta bez danych firmy klienta (nazwa firmy i NIP) - tworzenie i zapis oferty bez tych danych nadal działają. Senior może zbudować zespół z juniorów (sekcja „Mój zespół” w panelu seniora i administratora), a panel „Analiza” pokazuje mu wtedy dane własne oraz całego zespołu, z możliwością zawężenia do siebie lub wybranego juniora. Eksport ofert, panelu „Analiza” i historii PGL do Excela otwiera się teraz z kolumnami dopasowanymi do zawartości, bez ręcznego rozciągania. Dodano automatyczne liczenie transportu z trasy dostawy: rzeczywista odległość drogowa do klienta, cennik przewoźnika w pasmach kilometrowych, przeliczanie na kursy według ładowności 21 t i dopłaty za </w:t>
             </w:r>
             <w:r>
-              <w:t>elementy ponadwymiarowe, wraz z edytowalnym cennikiem w panelu administratora. Wysoki kontrast (jasny i ciemny) przeszedł na nowoczesną paletę kolorów wspólną ze zwykłym motywem – zamiast czerni-na-bieli tryb ten daje teraz większą czcionkę, powiększony widok i grubsze obramowania przy firmowych kolorach. Naprawiono też fałszywe ostrzeżenie o niezapisanych zmianach po rozpoczęciu nowej oferty w trakcie edycji zapisanej – pojawiało się mimo pustego, niezmienionego formularza.</w:t>
+              <w:t>elementy ponadwymiarowe, wraz z edytowalnym cennikiem w panelu administratora. Wysoki kontrast (jasny i ciemny) przeszedł na nowoczesną paletę kolorów wspólną ze zwykłym motywem – zamiast czerni-na-bieli tryb ten daje teraz większą czcionkę, powiększony widok i grubsze obramowania przy firmowych kolorach. Naprawiono też fałszywe ostrzeżenie o niezapisanych zmianach po rozpoczęciu nowej oferty w trakcie edycji zapisanej – pojawiało się mimo pustego, niezmienionego formularza. Blacha łezkowa otrzymała dopłatę wymiarową zależną od szerokości (30 €/t do 1,5 m, 45 €/t powyżej) oraz własną tabelę gatunków z domyślnym S235JR+N.</w:t>
             </w:r>
           </w:p>
         </w:tc>
@@ -897,6 +897,28 @@
           </w:p>
         </w:tc>
       </w:tr>
+      <w:tr>
+        <w:tc>
+          <w:tcPr>
+            <w:tcW w:w="1948" w:type="dxa"/>
+          </w:tcPr>
+          <w:p>
+            <w:r>
+              <w:t>Zmiana</w:t>
+            </w:r>
+          </w:p>
+        </w:tc>
+        <w:tc>
+          <w:tcPr>
+            <w:tcW w:w="6908" w:type="dxa"/>
+          </w:tcPr>
+          <w:p>
+            <w:r>
+              <w:t>Blacha łezkowa (Łezka) – dopłata „Dopłata Łezka” zależy teraz od szerokości taśmy: do 1,5 m włącznie 30 €/t, powyżej 1,5 m (do 2,05 m wg tabeli klienta) 45 €/t; wcześniej była stała 30 €/t niezależnie od wymiaru. Dodano też pełną tabelę gatunków dla Łezki (S235, S275 i S355 w odmianach JR/J2 oraz AR/N, a także S355MC i S500MC – każdy również w wariancie „-CAT_A”), na podstawie danych przekazanych przez klienta; wcześniej ten typ nie miał selektora gatunku, a dopłata gatunkowa wynosiła 0. Po przejściu na zakładkę „Łezka” podpowiadany jest domyślny gatunek S235JR+N.</w:t>
+            </w:r>
+          </w:p>
+        </w:tc>
+      </w:tr>
     </w:tbl>
     <w:p>
       <w:pPr>

</xml_diff>

<commit_message>
feat: salesperson performance metrics in Handlowcy panel
Admin "Handlowcy" list now shows per-salesperson win rate and offered
tonnage as columns, plus an expandable "Wyniki" strip: won/lost/undecided
offer counts and tonnage, first and last quote dates, account creation
date, and tonnage-weighted average margin.

GET /api/admin/users derives these from the latest version of each offer
family so repeated edits are not double-counted; offers_total and the
status counts are untouched. Adds admin.perf.* strings for pl/en/cs/de.

Logged in the v1.7 version report.

Co-Authored-By: Claude Sonnet 5 <noreply@anthropic.com>
Claude-Session: https://claude.ai/code/session_01JpFJoLJUfTRVNSxCkBWYmQ
</commit_message>
<xml_diff>
--- a/Historia wersji oraz md/Historia wersji/AMSteel_Quote_Raport_Wersji_1.7.docx
+++ b/Historia wersji oraz md/Historia wersji/AMSteel_Quote_Raport_Wersji_1.7.docx
@@ -1296,6 +1296,14 @@
     </w:tbl>
     <w:p>
       <w:pPr>
+        <w:pStyle w:val="Listapunktowana"/>
+      </w:pPr>
+      <w:r>
+        <w:t>Panel „Handlowcy” (panel administratora) – rozszerzony o metryki skuteczności każdego handlowca. Na liście dwie nowe kolumny: skuteczność % (z ofert wygranych / przegranych, bez wpływu ofert bez decyzji) oraz łączny tonaż ofertowany. Pod każdym wierszem rozwijana sekcja „Wyniki” z pełnym rozbiciem: data utworzenia konta, data pierwszej i ostatniej oferty, liczba ofert wygranych / przegranych / bez decyzji, tonaż wygrany / przegrany / bez decyzji oraz średnia marża ważona tonażem. Wszystkie liczby liczone z najnowszej wersji każdej oferty (edycje nie są liczone podwójnie); dotychczasowa kolumna „Liczba ofert” pozostaje bez zmian.</w:t>
+      </w:r>
+    </w:p>
+    <w:p>
+      <w:pPr>
         <w:spacing w:before="320" w:after="120"/>
       </w:pPr>
       <w:r>

</xml_diff>

<commit_message>
docs: v1.7 report — record successful production deployment
Migrations 019 (team_members) and 020 (transport_tariff_bands, route_cache)
run on production 10.09.2026 with the v1.7 release. Updated report date and
development period, filled the 1.7 "Data" cell, appended a deployment note to
the 1.7 changelog summary, and moved the 019/020 "awaiting deploy" bullets to
"deployed". Backup of the pre-edit .docx kept alongside per repo convention.

Co-Authored-By: Claude Sonnet 5 <noreply@anthropic.com>
Claude-Session: https://claude.ai/code/session_01WsqGC2D63cbTxQLHfhWU7p
</commit_message>
<xml_diff>
--- a/Historia wersji oraz md/Historia wersji/AMSteel_Quote_Raport_Wersji_1.7.docx
+++ b/Historia wersji oraz md/Historia wersji/AMSteel_Quote_Raport_Wersji_1.7.docx
@@ -115,12 +115,9 @@
           </w:tcPr>
           <w:p>
             <w:r>
-              <w:t>01.09.2026 -</w:t>
+              <w:t>01.09.2026 - 10.09.2026</w:t>
             </w:r>
             <w:proofErr w:type="gramStart"/>
-            <w:r>
-              <w:t xml:space="preserve"> ..</w:t>
-            </w:r>
             <w:proofErr w:type="gramEnd"/>
           </w:p>
         </w:tc>
@@ -146,7 +143,7 @@
           </w:tcPr>
           <w:p>
             <w:r>
-              <w:t>01.09.2026</w:t>
+              <w:t>10.09.2026</w:t>
             </w:r>
           </w:p>
         </w:tc>
@@ -280,7 +277,7 @@
           </w:tcPr>
           <w:p>
             <w:r>
-              <w:t>..</w:t>
+              <w:t>10.09.2026</w:t>
             </w:r>
           </w:p>
         </w:tc>
@@ -290,10 +287,7 @@
           </w:tcPr>
           <w:p>
             <w:r>
-              <w:t xml:space="preserve">Naprawiono błąd zapisu decyzji klienta (wygrana / przegrana) na ofercie wysłanej - konflikt typów parametru w zapytaniu SQL (kod 42P08); wcześniej funkcja nie zapisywała żadnej decyzji. Zablokowano wysyłkę oferty do klienta bez danych firmy klienta (nazwa firmy i NIP) - tworzenie i zapis oferty bez tych danych nadal działają. Senior może zbudować zespół z juniorów (sekcja „Mój zespół” w panelu seniora i administratora), a panel „Analiza” pokazuje mu wtedy dane własne oraz całego zespołu, z możliwością zawężenia do siebie lub wybranego juniora. Eksport ofert, panelu „Analiza” i historii PGL do Excela otwiera się teraz z kolumnami dopasowanymi do zawartości, bez ręcznego rozciągania. Dodano automatyczne liczenie transportu z trasy dostawy: rzeczywista odległość drogowa do klienta, cennik przewoźnika w pasmach kilometrowych, przeliczanie na kursy według ładowności 21 t i dopłaty za </w:t>
-            </w:r>
-            <w:r>
-              <w:t>elementy ponadwymiarowe, wraz z edytowalnym cennikiem w panelu administratora. Wysoki kontrast (jasny i ciemny) przeszedł na nowoczesną paletę kolorów wspólną ze zwykłym motywem – zamiast czerni-na-bieli tryb ten daje teraz większą czcionkę, powiększony widok i grubsze obramowania przy firmowych kolorach. Naprawiono też fałszywe ostrzeżenie o niezapisanych zmianach po rozpoczęciu nowej oferty w trakcie edycji zapisanej – pojawiało się mimo pustego, niezmienionego formularza. Blacha łezkowa otrzymała dopłatę wymiarową zależną od szerokości (30 €/t do 1,5 m, 45 €/t powyżej) oraz własną tabelę gatunków z domyślnym S235JR+N.</w:t>
+              <w:t>Naprawiono błąd zapisu decyzji klienta (wygrana / przegrana) na ofercie wysłanej - konflikt typów parametru w zapytaniu SQL (kod 42P08); wcześniej funkcja nie zapisywała żadnej decyzji. Zablokowano wysyłkę oferty do klienta bez danych firmy klienta (nazwa firmy i NIP) - tworzenie i zapis oferty bez tych danych nadal działają. Senior może zbudować zespół z juniorów (sekcja „Mój zespół” w panelu seniora i administratora), a panel „Analiza” pokazuje mu wtedy dane własne oraz całego zespołu, z możliwością zawężenia do siebie lub wybranego juniora. Eksport ofert, panelu „Analiza” i historii PGL do Excela otwiera się teraz z kolumnami dopasowanymi do zawartości, bez ręcznego rozciągania. Dodano automatyczne liczenie transportu z trasy dostawy: rzeczywista odległość drogowa do klienta, cennik przewoźnika w pasmach kilometrowych, przeliczanie na kursy według ładowności 21 t i dopłaty za elementy ponadwymiarowe, wraz z edytowalnym cennikiem w panelu administratora. Wysoki kontrast (jasny i ciemny) przeszedł na nowoczesną paletę kolorów wspólną ze zwykłym motywem – zamiast czerni-na-bieli tryb ten daje teraz większą czcionkę, powiększony widok i grubsze obramowania przy firmowych kolorach. Naprawiono też fałszywe ostrzeżenie o niezapisanych zmianach po rozpoczęciu nowej oferty w trakcie edycji zapisanej – pojawiało się mimo pustego, niezmienionego formularza. Blacha łezkowa otrzymała dopłatę wymiarową zależną od szerokości (30 €/t do 1,5 m, 45 €/t powyżej) oraz własną tabelę gatunków z domyślnym S235JR+N. Wersja 1.7 została wdrożona na środowisko produkcyjne 10.09.2026 wraz z migracjami 019 (zespoły seniora, tabela „team_members”) i 020 (cennik transportowy, tabele „transport_tariff_bands” i „route_cache”); wdrożenie zakończone powodzeniem.</w:t>
             </w:r>
           </w:p>
         </w:tc>
@@ -1364,7 +1358,7 @@
         <w:pStyle w:val="Listapunktowana"/>
       </w:pPr>
       <w:r>
-        <w:t>Zespoły seniora i zakres panelu „Analiza” dla seniora (migracja 019, tabela „team_members”) - zbudowane i przetestowane lokalnie, oczekują na uruchomienie migracji i wdrożenie na środowisko produkcyjne.</w:t>
+        <w:t>Zespoły seniora i zakres panelu „Analiza” dla seniora (migracja 019, tabela „team_members”) - wdrożone na środowisko produkcyjne 10.09.2026 wraz z wersją 1.7 (migracja 019 uruchomiona).</w:t>
       </w:r>
     </w:p>
     <w:p>
@@ -1372,7 +1366,7 @@
         <w:pStyle w:val="Listapunktowana"/>
       </w:pPr>
       <w:r>
-        <w:t>Migracja cennika transportowego (020, tabele „transport_tariff_bands” i „route_cache”) nie została jeszcze uruchomiona na środowisku produkcyjnym – wymagana przed korzystaniem z automatycznego liczenia transportu. Do czasu jej uruchomienia aplikacja działa na cenniku domyślnym. Opcjonalny klucz Geoapify (dokładniejsze trasy dla TIR-a) nie jest jeszcze ustawiony – bez niego odległości liczone są na darmowych serwerach OpenStreetMap.</w:t>
+        <w:t>Migracja cennika transportowego (020, tabele „transport_tariff_bands” i „route_cache”) - uruchomiona na środowisku produkcyjnym 10.09.2026 wraz z wdrożeniem wersji 1.7; automatyczne liczenie transportu jest aktywne. Opcjonalny klucz Geoapify (dokładniejsze trasy dla TIR-a) nadal nie jest ustawiony – bez niego odległości liczone są na darmowych serwerach OpenStreetMap.</w:t>
       </w:r>
     </w:p>
     <w:p>

</xml_diff>